<commit_message>
AB doc: Word-only, three-arm partition diagram, HMM hypothesis update
- Update hypothesis (T1=first-day; S1/S2/S3 model-defined) and background
- Add ab_diagram.py rendering the split/segmentation diagram (PNG, CJK)
- Value-intervention layer now shows three arms: dynamic_rtp / retention(ON) / default(OFF holdout)
- Embed diagram into the Word doc; drop the html/md variants (Word-only)

Co-Authored-By: Claude Opus 4.8 (1M context) <noreply@anthropic.com>
</commit_message>
<xml_diff>
--- a/prd/ab_testing/挽留策略AB实验设计_v1.0.docx
+++ b/prd/ab_testing/挽留策略AB实验设计_v1.0.docx
@@ -130,7 +130,7 @@
           <w:rFonts w:ascii="Calibri" w:hAnsi="Calibri" w:eastAsia="PingFang SC"/>
           <w:sz w:val="21"/>
         </w:rPr>
-        <w:t>H-S3（escaped/流失）：挽留对高流失风险人群提升最大（重点验证）。</w:t>
+        <w:t>H-T1（初始）：挽留对新客/首触早期留存的影响（第一天玩家，计算时间为首次登陆时间的第一个自然日）。</w:t>
       </w:r>
     </w:p>
     <w:p>
@@ -142,7 +142,7 @@
           <w:rFonts w:ascii="Calibri" w:hAnsi="Calibri" w:eastAsia="PingFang SC"/>
           <w:sz w:val="21"/>
         </w:rPr>
-        <w:t>H-S1（low）：挽留能把低活跃拉回活跃。</w:t>
+        <w:t>H-S1（low）：模型定义分类。</w:t>
       </w:r>
     </w:p>
     <w:p>
@@ -154,7 +154,7 @@
           <w:rFonts w:ascii="Calibri" w:hAnsi="Calibri" w:eastAsia="PingFang SC"/>
           <w:sz w:val="21"/>
         </w:rPr>
-        <w:t>H-S2（engaged）：挽留对已活跃人群边际提升有限（可能无效，验证是否浪费成本）。</w:t>
+        <w:t>H-S2（engaged）：模型定义分类。</w:t>
       </w:r>
     </w:p>
     <w:p>
@@ -166,7 +166,7 @@
           <w:rFonts w:ascii="Calibri" w:hAnsi="Calibri" w:eastAsia="PingFang SC"/>
           <w:sz w:val="21"/>
         </w:rPr>
-        <w:t>H-T1（初始）：挽留对新客/首触早期留存的影响（含义待确认）。</w:t>
+        <w:t>H-S3（escaped/流失）：模型定义分类。</w:t>
       </w:r>
     </w:p>
     <w:p>
@@ -204,7 +204,7 @@
           <w:i w:val="0"/>
           <w:sz w:val="21"/>
         </w:rPr>
-        <w:t>个性化挽留系统已上线并按生命周期给玩家打 CR_FISHING_V1:Tk 标签、施加加成，但当前没有干净对照来量化“挽留带来多少增量、对哪类人有效”。本实验建立挽留 ON vs OFF 的随机对照，并用处理无关的 HMM 状态分层，回答：挽留的因果增量，以及对哪种生命周期状态最该投入。</w:t>
+        <w:t>个性化挽留系统一期已上线，但当前没有干净对照来量化“挽留带来多少增量、对哪类人有效”。本实验建立挽留 ON vs OFF 的随机对照，并用处理无关的 HMM 状态分层，回答：挽留的因果增量，以及对哪种生命周期状态最该投入。</w:t>
       </w:r>
     </w:p>
     <w:p>
@@ -291,7 +291,61 @@
           <w:color w:val="656D76"/>
           <w:sz w:val="19"/>
         </w:rPr>
-        <w:t>分割逻辑：全体 →（风控? 是→出局 / 否）→ 实验人群 →（dynamic_rtp 臂：单独 RTP 实验）+（挽留 AB：挽留ON+holdout OFF，均 RTP-off）→ 按 HMM 状态 T1/S1/S2/S3 各分 OFF|ON。</w:t>
+        <w:t>分割逻辑：全体 →（风控? 是→出局 / 否）→ 实验人群 → 三臂 dynamic_rtp（单独 RTP 实验，排除）/ 个性化挽留 retention（挽留 ON）/ default（holdout，挽留 OFF）；挽留 AB = retention(ON) vs default(OFF)，两臂均 RTP-off，按 HMM 状态 T1/S1/S2/S3 各分 OFF|ON。</w:t>
+      </w:r>
+    </w:p>
+    <w:p>
+      <w:pPr>
+        <w:jc w:val="center"/>
+      </w:pPr>
+      <w:r>
+        <w:drawing>
+          <wp:inline xmlns:a="http://schemas.openxmlformats.org/drawingml/2006/main" xmlns:pic="http://schemas.openxmlformats.org/drawingml/2006/picture">
+            <wp:extent cx="5760720" cy="4400691"/>
+            <wp:docPr id="1" name="Picture 1"/>
+            <wp:cNvGraphicFramePr>
+              <a:graphicFrameLocks noChangeAspect="1"/>
+            </wp:cNvGraphicFramePr>
+            <a:graphic>
+              <a:graphicData uri="http://schemas.openxmlformats.org/drawingml/2006/picture">
+                <pic:pic>
+                  <pic:nvPicPr>
+                    <pic:cNvPr id="0" name="分流分层图.png"/>
+                    <pic:cNvPicPr/>
+                  </pic:nvPicPr>
+                  <pic:blipFill>
+                    <a:blip r:embed="rId9"/>
+                    <a:stretch>
+                      <a:fillRect/>
+                    </a:stretch>
+                  </pic:blipFill>
+                  <pic:spPr>
+                    <a:xfrm>
+                      <a:off x="0" y="0"/>
+                      <a:ext cx="5760720" cy="4400691"/>
+                    </a:xfrm>
+                    <a:prstGeom prst="rect"/>
+                  </pic:spPr>
+                </pic:pic>
+              </a:graphicData>
+            </a:graphic>
+          </wp:inline>
+        </w:drawing>
+      </w:r>
+    </w:p>
+    <w:p>
+      <w:pPr>
+        <w:jc w:val="center"/>
+      </w:pPr>
+      <w:r>
+        <w:rPr>
+          <w:rFonts w:ascii="Calibri" w:hAnsi="Calibri" w:eastAsia="PingFang SC"/>
+          <w:b w:val="0"/>
+          <w:i w:val="0"/>
+          <w:color w:val="656D76"/>
+          <w:sz w:val="18"/>
+        </w:rPr>
+        <w:t>图 1 · 挽留 AB 分流分层图</w:t>
       </w:r>
     </w:p>
     <w:p>

</xml_diff>